<commit_message>
Add PDF exports and updated Matsuoka docx files
Co-Authored-By: Claude Sonnet 5 <noreply@anthropic.com>
</commit_message>
<xml_diff>
--- a/Matsuoka Oba-chan (Ideko-san?)and flowers final (1 of 2).docx
+++ b/Matsuoka Oba-chan (Ideko-san?)and flowers final (1 of 2).docx
@@ -10,114 +10,49 @@
         <w:rPr/>
       </w:pPr>
       <w:r/>
-      <w:r/>
-      <w:r/>
-      <w:r/>
       <w:r>
         <mc:AlternateContent>
           <mc:Choice Requires="wpg">
             <w:drawing>
-              <wp:anchor xmlns:wp="http://schemas.openxmlformats.org/drawingml/2006/wordprocessingDrawing" xmlns:wp14="http://schemas.microsoft.com/office/word/2010/wordprocessingDrawing" distT="0" distB="0" distL="115200" distR="115200" simplePos="0" relativeHeight="33792" behindDoc="0" locked="0" layoutInCell="1" allowOverlap="1">
+              <wp:anchor xmlns:wp="http://schemas.openxmlformats.org/drawingml/2006/wordprocessingDrawing" xmlns:wp14="http://schemas.microsoft.com/office/word/2010/wordprocessingDrawing" distT="0" distB="0" distL="115200" distR="115200" simplePos="0" relativeHeight="120832" behindDoc="1" locked="0" layoutInCell="1" allowOverlap="1">
                 <wp:simplePos x="0" y="0"/>
                 <wp:positionH relativeFrom="column">
-                  <wp:posOffset>-397828</wp:posOffset>
+                  <wp:posOffset>-690563</wp:posOffset>
                 </wp:positionH>
                 <wp:positionV relativeFrom="paragraph">
-                  <wp:posOffset>-102187</wp:posOffset>
+                  <wp:posOffset>-126813</wp:posOffset>
                 </wp:positionV>
-                <wp:extent cx="5742328" cy="461550"/>
-                <wp:effectExtent l="3175" t="3175" r="3175" b="3175"/>
+                <wp:extent cx="5177813" cy="1031718"/>
+                <wp:effectExtent l="0" t="0" r="0" b="0"/>
                 <wp:wrapNone/>
                 <wp:docPr id="1" name=""/>
-                <wp:cNvGraphicFramePr/>
+                <wp:cNvGraphicFramePr>
+                  <a:graphicFrameLocks xmlns:a="http://schemas.openxmlformats.org/drawingml/2006/main" noChangeAspect="1"/>
+                </wp:cNvGraphicFramePr>
                 <a:graphic xmlns:a="http://schemas.openxmlformats.org/drawingml/2006/main">
-                  <a:graphicData uri="http://schemas.microsoft.com/office/word/2010/wordprocessingShape">
-                    <wps:wsp>
-                      <wps:cNvPr id="1984612986" name=""/>
-                      <wps:cNvSpPr txBox="1"/>
-                      <wps:spPr bwMode="auto">
-                        <a:xfrm rot="0" flipH="0" flipV="0">
+                  <a:graphicData uri="http://schemas.openxmlformats.org/drawingml/2006/picture">
+                    <pic:pic xmlns:pic="http://schemas.openxmlformats.org/drawingml/2006/picture">
+                      <pic:nvPicPr>
+                        <pic:cNvPr id="1408902011" name=""/>
+                        <pic:cNvPicPr>
+                          <a:picLocks noChangeAspect="1"/>
+                        </pic:cNvPicPr>
+                        <pic:nvPr/>
+                      </pic:nvPicPr>
+                      <pic:blipFill rotWithShape="1">
+                        <a:blip r:embed="rId8"/>
+                        <a:stretch/>
+                      </pic:blipFill>
+                      <pic:spPr bwMode="auto">
+                        <a:xfrm flipH="0" flipV="0">
                           <a:off x="0" y="0"/>
-                          <a:ext cx="5742327" cy="461549"/>
+                          <a:ext cx="5177812" cy="1031717"/>
                         </a:xfrm>
                         <a:prstGeom prst="rect">
                           <a:avLst/>
                         </a:prstGeom>
-                        <a:noFill/>
-                        <a:ln w="6350">
-                          <a:noFill/>
-                        </a:ln>
-                      </wps:spPr>
-                      <wps:txbx>
-                        <w:txbxContent>
-                          <w:p>
-                            <w:pPr>
-                              <w:pBdr>
-                                <w:top w:val="none" w:color="000000" w:sz="4" w:space="0"/>
-                                <w:left w:val="none" w:color="000000" w:sz="4" w:space="0"/>
-                                <w:bottom w:val="none" w:color="000000" w:sz="4" w:space="0"/>
-                                <w:right w:val="none" w:color="000000" w:sz="4" w:space="0"/>
-                              </w:pBdr>
-                              <w:spacing w:line="360" w:lineRule="atLeast"/>
-                              <w:ind w:right="0" w:firstLine="0" w:left="0"/>
-                              <w:rPr>
-                                <w:rFonts w:ascii="Noto Serif CJK HK" w:hAnsi="Noto Serif CJK HK" w:cs="Noto Serif CJK HK"/>
-                                <w:b/>
-                                <w:bCs/>
-                                <w:sz w:val="40"/>
-                                <w:szCs w:val="40"/>
-                              </w:rPr>
-                            </w:pPr>
-                            <w:r>
-                              <w:rPr>
-                                <w:rFonts w:ascii="Noto Serif CJK HK" w:hAnsi="Noto Serif CJK HK" w:eastAsia="Noto Serif CJK HK" w:cs="Noto Serif CJK HK"/>
-                                <w:b/>
-                                <w:bCs/>
-                                <w:color w:val="000000"/>
-                                <w:spacing w:val="-1"/>
-                                <w:sz w:val="40"/>
-                                <w:szCs w:val="40"/>
-                              </w:rPr>
-                              <w:t xml:space="preserve">連句 — 「誰が誰を支えていたのか」</w:t>
-                            </w:r>
-                            <w:r>
-                              <w:rPr>
-                                <w:rFonts w:ascii="Noto Serif CJK HK" w:hAnsi="Noto Serif CJK HK" w:eastAsia="Noto Serif CJK HK" w:cs="Noto Serif CJK HK"/>
-                                <w:b/>
-                                <w:bCs/>
-                                <w:sz w:val="40"/>
-                                <w:szCs w:val="40"/>
-                              </w:rPr>
-                            </w:r>
-                            <w:r>
-                              <w:rPr>
-                                <w:rFonts w:ascii="Noto Serif CJK HK" w:hAnsi="Noto Serif CJK HK" w:cs="Noto Serif CJK HK"/>
-                                <w:b/>
-                                <w:bCs/>
-                                <w:sz w:val="40"/>
-                                <w:szCs w:val="40"/>
-                              </w:rPr>
-                            </w:r>
-                          </w:p>
-                          <w:p>
-                            <w:pPr>
-                              <w:pBdr/>
-                              <w:spacing/>
-                              <w:ind/>
-                              <w:rPr/>
-                            </w:pPr>
-                            <w:r>
-                              <w:rPr>
-                                <w:lang w:val="ja-JP"/>
-                              </w:rPr>
-                            </w:r>
-                            <w:r/>
-                            <w:r/>
-                          </w:p>
-                        </w:txbxContent>
-                      </wps:txbx>
-                      <wps:bodyPr vertOverflow="overflow" horzOverflow="overflow" vert="horz" wrap="square" lIns="91440" tIns="45720" rIns="91440" bIns="45720" numCol="1" spcCol="0" rtlCol="0" fromWordArt="0" anchor="t" anchorCtr="0" forceAA="0" upright="0" compatLnSpc="0"/>
-                    </wps:wsp>
+                      </pic:spPr>
+                    </pic:pic>
                   </a:graphicData>
                 </a:graphic>
               </wp:anchor>
@@ -125,80 +60,44 @@
           </mc:Choice>
           <mc:Fallback>
             <w:pict>
-              <v:shape id="shape 0" o:spid="_x0000_s0" o:spt="202" type="#_x0000_t202" style="position:absolute;z-index:33792;o:allowoverlap:true;o:allowincell:true;mso-position-horizontal-relative:text;margin-left:-31.33pt;mso-position-horizontal:absolute;mso-position-vertical-relative:text;margin-top:-8.05pt;mso-position-vertical:absolute;width:452.15pt;height:36.34pt;mso-wrap-distance-left:9.07pt;mso-wrap-distance-top:0.00pt;mso-wrap-distance-right:9.07pt;mso-wrap-distance-bottom:0.00pt;rotation:0;v-text-anchor:top;visibility:visible;" filled="f" stroked="f" strokeweight="0.50pt">
-                <v:textbox inset="0,0,0,0">
-                  <w:txbxContent>
-                    <w:p>
-                      <w:pPr>
-                        <w:pBdr>
-                          <w:top w:val="none" w:color="000000" w:sz="4" w:space="0"/>
-                          <w:left w:val="none" w:color="000000" w:sz="4" w:space="0"/>
-                          <w:bottom w:val="none" w:color="000000" w:sz="4" w:space="0"/>
-                          <w:right w:val="none" w:color="000000" w:sz="4" w:space="0"/>
-                        </w:pBdr>
-                        <w:spacing w:line="360" w:lineRule="atLeast"/>
-                        <w:ind w:right="0" w:firstLine="0" w:left="0"/>
-                        <w:rPr>
-                          <w:rFonts w:ascii="Noto Serif CJK HK" w:hAnsi="Noto Serif CJK HK" w:cs="Noto Serif CJK HK"/>
-                          <w:b/>
-                          <w:bCs/>
-                          <w:sz w:val="40"/>
-                          <w:szCs w:val="40"/>
-                        </w:rPr>
-                      </w:pPr>
-                      <w:r>
-                        <w:rPr>
-                          <w:rFonts w:ascii="Noto Serif CJK HK" w:hAnsi="Noto Serif CJK HK" w:eastAsia="Noto Serif CJK HK" w:cs="Noto Serif CJK HK"/>
-                          <w:b/>
-                          <w:bCs/>
-                          <w:color w:val="000000"/>
-                          <w:spacing w:val="-1"/>
-                          <w:sz w:val="40"/>
-                          <w:szCs w:val="40"/>
-                        </w:rPr>
-                        <w:t xml:space="preserve">連句 — 「誰が誰を支えていたのか」</w:t>
-                      </w:r>
-                      <w:r>
-                        <w:rPr>
-                          <w:rFonts w:ascii="Noto Serif CJK HK" w:hAnsi="Noto Serif CJK HK" w:eastAsia="Noto Serif CJK HK" w:cs="Noto Serif CJK HK"/>
-                          <w:b/>
-                          <w:bCs/>
-                          <w:sz w:val="40"/>
-                          <w:szCs w:val="40"/>
-                        </w:rPr>
-                      </w:r>
-                      <w:r>
-                        <w:rPr>
-                          <w:rFonts w:ascii="Noto Serif CJK HK" w:hAnsi="Noto Serif CJK HK" w:cs="Noto Serif CJK HK"/>
-                          <w:b/>
-                          <w:bCs/>
-                          <w:sz w:val="40"/>
-                          <w:szCs w:val="40"/>
-                        </w:rPr>
-                      </w:r>
-                    </w:p>
-                    <w:p>
-                      <w:pPr>
-                        <w:pBdr/>
-                        <w:spacing/>
-                        <w:ind/>
-                        <w:rPr/>
-                      </w:pPr>
-                      <w:r>
-                        <w:rPr>
-                          <w:lang w:val="ja-JP"/>
-                        </w:rPr>
-                      </w:r>
-                      <w:r/>
-                      <w:r/>
-                    </w:p>
-                  </w:txbxContent>
-                </v:textbox>
+              <v:shapetype id="_x0000_t75" coordsize="21600,21600" o:spt="75" o:preferrelative="t" path="m@4@5l@4@11@9@11@9@5xe" filled="f" stroked="f">
+                <v:stroke joinstyle="miter"/>
+                <v:formulas>
+                  <v:f eqn="if lineDrawn pixelLineWidth 0"/>
+                  <v:f eqn="sum @0 1 0"/>
+                  <v:f eqn="sum 0 0 @1"/>
+                  <v:f eqn="prod @2 1 2"/>
+                  <v:f eqn="prod @3 21600 pixelWidth"/>
+                  <v:f eqn="prod @3 21600 pixelHeight"/>
+                  <v:f eqn="sum @0 0 1"/>
+                  <v:f eqn="prod @6 1 2"/>
+                  <v:f eqn="prod @7 21600 pixelWidth"/>
+                  <v:f eqn="sum @8 21600 0"/>
+                  <v:f eqn="prod @7 21600 pixelHeight"/>
+                  <v:f eqn="sum @10 21600 0"/>
+                </v:formulas>
+                <v:path o:extrusionok="f" gradientshapeok="t" o:connecttype="rect"/>
+                <o:lock v:ext="edit" aspectratio="t"/>
+              </v:shapetype>
+              <v:shape id="_x0000_i0" o:spid="_x0000_s0" type="#_x0000_t75" style="position:absolute;z-index:-120832;o:allowoverlap:true;o:allowincell:true;mso-position-horizontal-relative:text;margin-left:-54.38pt;mso-position-horizontal:absolute;mso-position-vertical-relative:text;margin-top:-9.99pt;mso-position-vertical:absolute;width:407.70pt;height:81.24pt;mso-wrap-distance-left:9.07pt;mso-wrap-distance-top:0.00pt;mso-wrap-distance-right:9.07pt;mso-wrap-distance-bottom:0.00pt;z-index:1;" stroked="false">
+                <v:imagedata r:id="rId8" o:title=""/>
+                <o:lock v:ext="edit" rotation="t"/>
               </v:shape>
             </w:pict>
           </mc:Fallback>
         </mc:AlternateContent>
       </w:r>
+      <w:r/>
+      <w:r/>
+      <w:r/>
+    </w:p>
+    <w:p>
+      <w:pPr>
+        <w:pBdr/>
+        <w:spacing/>
+        <w:ind/>
+        <w:rPr/>
+      </w:pPr>
       <w:r/>
       <w:r/>
     </w:p>
@@ -276,14 +175,9 @@
                               </w:rPr>
                               <w:t xml:space="preserve"> </w:t>
                             </w:r>
-                            <w:r/>
                             <w:r>
                               <w:t xml:space="preserve">Mitsue</w:t>
                             </w:r>
-                            <w:r/>
-                            <w:r/>
-                            <w:r/>
-                            <w:r/>
                             <w:r/>
                           </w:p>
                         </w:txbxContent>
@@ -322,14 +216,9 @@
                         </w:rPr>
                         <w:t xml:space="preserve"> </w:t>
                       </w:r>
-                      <w:r/>
                       <w:r>
                         <w:t xml:space="preserve">Mitsue</w:t>
                       </w:r>
-                      <w:r/>
-                      <w:r/>
-                      <w:r/>
-                      <w:r/>
                       <w:r/>
                     </w:p>
                   </w:txbxContent>
@@ -341,13 +230,7 @@
       </w:r>
       <w:r>
         <w:rPr>
-          <w:lang w:val="ja-JP"/>
-        </w:rPr>
-      </w:r>
-      <w:r/>
-      <w:r>
-        <w:rPr>
-          <w:lang w:val="ja-JP"/>
+          <w:highlight w:val="none"/>
         </w:rPr>
       </w:r>
       <w:r>
@@ -363,7 +246,6 @@
         <w:ind/>
         <w:rPr/>
       </w:pPr>
-      <w:r/>
       <w:r>
         <mc:AlternateContent>
           <mc:Choice Requires="wpg">
@@ -394,7 +276,7 @@
                         <pic:nvPr/>
                       </pic:nvPicPr>
                       <pic:blipFill rotWithShape="1">
-                        <a:blip r:embed="rId8"/>
+                        <a:blip r:embed="rId9"/>
                         <a:stretch/>
                       </pic:blipFill>
                       <pic:spPr bwMode="auto">
@@ -434,7 +316,7 @@
                 <o:lock v:ext="edit" aspectratio="t"/>
               </v:shapetype>
               <v:shape id="_x0000_i2" o:spid="_x0000_s2" type="#_x0000_t75" style="position:absolute;z-index:-63488;o:allowoverlap:true;o:allowincell:true;mso-position-horizontal-relative:text;margin-left:-38.67pt;mso-position-horizontal:absolute;mso-position-vertical-relative:text;margin-top:8.80pt;mso-position-vertical:absolute;width:548.58pt;height:284.76pt;mso-wrap-distance-left:9.07pt;mso-wrap-distance-top:0.00pt;mso-wrap-distance-right:9.07pt;mso-wrap-distance-bottom:0.00pt;z-index:1;" stroked="false">
-                <v:imagedata r:id="rId8" o:title=""/>
+                <v:imagedata r:id="rId9" o:title=""/>
                 <o:lock v:ext="edit" rotation="t"/>
               </v:shape>
             </w:pict>
@@ -442,7 +324,6 @@
         </mc:AlternateContent>
       </w:r>
       <w:r/>
-      <w:r/>
     </w:p>
     <w:p>
       <w:pPr>
@@ -483,7 +364,14 @@
       </w:pPr>
       <w:r/>
       <w:r/>
-      <w:r/>
+    </w:p>
+    <w:p>
+      <w:pPr>
+        <w:pBdr/>
+        <w:spacing/>
+        <w:ind/>
+        <w:rPr/>
+      </w:pPr>
       <w:r/>
       <w:r/>
     </w:p>
@@ -496,11 +384,6 @@
       </w:pPr>
       <w:r/>
       <w:r/>
-      <w:r/>
-      <w:r/>
-      <w:r/>
-      <w:r/>
-      <w:r/>
     </w:p>
     <w:p>
       <w:pPr>
@@ -509,18 +392,6 @@
         <w:ind/>
         <w:rPr/>
       </w:pPr>
-      <w:r/>
-      <w:r/>
-      <w:r/>
-    </w:p>
-    <w:p>
-      <w:pPr>
-        <w:pBdr/>
-        <w:spacing/>
-        <w:ind/>
-        <w:rPr/>
-      </w:pPr>
-      <w:r/>
       <w:r>
         <mc:AlternateContent>
           <mc:Choice Requires="wpg">
@@ -551,7 +422,7 @@
                         <pic:nvPr/>
                       </pic:nvPicPr>
                       <pic:blipFill rotWithShape="1">
-                        <a:blip r:embed="rId9"/>
+                        <a:blip r:embed="rId10"/>
                         <a:stretch/>
                       </pic:blipFill>
                       <pic:spPr bwMode="auto">
@@ -591,14 +462,13 @@
                 <o:lock v:ext="edit" aspectratio="t"/>
               </v:shapetype>
               <v:shape id="_x0000_i3" o:spid="_x0000_s3" type="#_x0000_t75" style="position:absolute;z-index:25600;o:allowoverlap:true;o:allowincell:true;mso-position-horizontal-relative:text;margin-left:-46.99pt;mso-position-horizontal:absolute;mso-position-vertical-relative:text;margin-top:501.85pt;mso-position-vertical:absolute;width:31.33pt;height:31.87pt;mso-wrap-distance-left:9.07pt;mso-wrap-distance-top:0.00pt;mso-wrap-distance-right:9.07pt;mso-wrap-distance-bottom:0.00pt;rotation:0;z-index:1;" stroked="false">
-                <v:imagedata r:id="rId9" o:title=""/>
+                <v:imagedata r:id="rId10" o:title=""/>
                 <o:lock v:ext="edit" rotation="t"/>
               </v:shape>
             </w:pict>
           </mc:Fallback>
         </mc:AlternateContent>
       </w:r>
-      <w:r/>
       <w:r>
         <mc:AlternateContent>
           <mc:Choice Requires="wpg">
@@ -697,10 +567,9 @@
                               </w:rPr>
                               <w:t xml:space="preserve">quietly stays close beside her</w:t>
                             </w:r>
-                            <w:r/>
                             <w:r>
                               <w:rPr>
-                                <w:rFonts w:ascii="Open Sans" w:hAnsi="Open Sans" w:eastAsia="Open Sans" w:cs="Open Sans"/>
+                                <w:rFonts w:ascii="Open Sans" w:hAnsi="Open Sans" w:cs="Open Sans"/>
                                 <w:b w:val="0"/>
                                 <w:bCs w:val="0"/>
                                 <w:sz w:val="16"/>
@@ -792,10 +661,9 @@
                         </w:rPr>
                         <w:t xml:space="preserve">quietly stays close beside her</w:t>
                       </w:r>
-                      <w:r/>
                       <w:r>
                         <w:rPr>
-                          <w:rFonts w:ascii="Open Sans" w:hAnsi="Open Sans" w:eastAsia="Open Sans" w:cs="Open Sans"/>
+                          <w:rFonts w:ascii="Open Sans" w:hAnsi="Open Sans" w:cs="Open Sans"/>
                           <w:b w:val="0"/>
                           <w:bCs w:val="0"/>
                           <w:sz w:val="16"/>
@@ -819,7 +687,6 @@
           </mc:Fallback>
         </mc:AlternateContent>
       </w:r>
-      <w:r/>
       <w:r>
         <mc:AlternateContent>
           <mc:Choice Requires="wpg">
@@ -918,7 +785,6 @@
                               </w:rPr>
                               <w:t xml:space="preserve">the family they'd grow into</w:t>
                             </w:r>
-                            <w:r/>
                             <w:r>
                               <w:rPr>
                                 <w:rFonts w:ascii="Open Sans" w:hAnsi="Open Sans" w:eastAsia="Open Sans" w:cs="Open Sans"/>
@@ -1013,7 +879,6 @@
                         </w:rPr>
                         <w:t xml:space="preserve">the family they'd grow into</w:t>
                       </w:r>
-                      <w:r/>
                       <w:r>
                         <w:rPr>
                           <w:rFonts w:ascii="Open Sans" w:hAnsi="Open Sans" w:eastAsia="Open Sans" w:cs="Open Sans"/>
@@ -1040,7 +905,6 @@
           </mc:Fallback>
         </mc:AlternateContent>
       </w:r>
-      <w:r/>
       <w:r>
         <mc:AlternateContent>
           <mc:Choice Requires="wpg">
@@ -1136,12 +1000,8 @@
                               </w:rPr>
                               <w:t xml:space="preserve">as if it had come here on its own</w:t>
                             </w:r>
-                            <w:r/>
                             <w:r>
                               <w:rPr>
-                                <w:rFonts w:ascii="Open Sans" w:hAnsi="Open Sans" w:eastAsia="Open Sans" w:cs="Open Sans"/>
-                                <w:b w:val="0"/>
-                                <w:bCs w:val="0"/>
                                 <w:sz w:val="16"/>
                                 <w:szCs w:val="16"/>
                               </w:rPr>
@@ -1225,12 +1085,8 @@
                         </w:rPr>
                         <w:t xml:space="preserve">as if it had come here on its own</w:t>
                       </w:r>
-                      <w:r/>
                       <w:r>
                         <w:rPr>
-                          <w:rFonts w:ascii="Open Sans" w:hAnsi="Open Sans" w:eastAsia="Open Sans" w:cs="Open Sans"/>
-                          <w:b w:val="0"/>
-                          <w:bCs w:val="0"/>
                           <w:sz w:val="16"/>
                           <w:szCs w:val="16"/>
                         </w:rPr>
@@ -1249,7 +1105,6 @@
           </mc:Fallback>
         </mc:AlternateContent>
       </w:r>
-      <w:r/>
       <w:r>
         <mc:AlternateContent>
           <mc:Choice Requires="wpg">
@@ -1348,10 +1203,9 @@
                               </w:rPr>
                               <w:t xml:space="preserve">opens itself, gently</w:t>
                             </w:r>
-                            <w:r/>
                             <w:r>
                               <w:rPr>
-                                <w:rFonts w:ascii="Open Sans" w:hAnsi="Open Sans" w:eastAsia="Open Sans" w:cs="Open Sans"/>
+                                <w:rFonts w:ascii="Open Sans" w:hAnsi="Open Sans" w:cs="Open Sans"/>
                                 <w:b w:val="0"/>
                                 <w:bCs w:val="0"/>
                                 <w:sz w:val="16"/>
@@ -1443,10 +1297,9 @@
                         </w:rPr>
                         <w:t xml:space="preserve">opens itself, gently</w:t>
                       </w:r>
-                      <w:r/>
                       <w:r>
                         <w:rPr>
-                          <w:rFonts w:ascii="Open Sans" w:hAnsi="Open Sans" w:eastAsia="Open Sans" w:cs="Open Sans"/>
+                          <w:rFonts w:ascii="Open Sans" w:hAnsi="Open Sans" w:cs="Open Sans"/>
                           <w:b w:val="0"/>
                           <w:bCs w:val="0"/>
                           <w:sz w:val="16"/>
@@ -1470,7 +1323,6 @@
           </mc:Fallback>
         </mc:AlternateContent>
       </w:r>
-      <w:r/>
       <w:r>
         <mc:AlternateContent>
           <mc:Choice Requires="wpg">
@@ -1569,10 +1421,9 @@
                               </w:rPr>
                               <w:t xml:space="preserve">love needs no name</w:t>
                             </w:r>
-                            <w:r/>
                             <w:r>
                               <w:rPr>
-                                <w:rFonts w:ascii="Open Sans" w:hAnsi="Open Sans" w:eastAsia="Open Sans" w:cs="Open Sans"/>
+                                <w:rFonts w:ascii="Open Sans" w:hAnsi="Open Sans" w:cs="Open Sans"/>
                                 <w:b w:val="0"/>
                                 <w:bCs w:val="0"/>
                                 <w:sz w:val="16"/>
@@ -1664,10 +1515,9 @@
                         </w:rPr>
                         <w:t xml:space="preserve">love needs no name</w:t>
                       </w:r>
-                      <w:r/>
                       <w:r>
                         <w:rPr>
-                          <w:rFonts w:ascii="Open Sans" w:hAnsi="Open Sans" w:eastAsia="Open Sans" w:cs="Open Sans"/>
+                          <w:rFonts w:ascii="Open Sans" w:hAnsi="Open Sans" w:cs="Open Sans"/>
                           <w:b w:val="0"/>
                           <w:bCs w:val="0"/>
                           <w:sz w:val="16"/>
@@ -1691,7 +1541,6 @@
           </mc:Fallback>
         </mc:AlternateContent>
       </w:r>
-      <w:r/>
       <w:r>
         <mc:AlternateContent>
           <mc:Choice Requires="wpg">
@@ -1755,6 +1604,12 @@
                                 <w:szCs w:val="16"/>
                               </w:rPr>
                             </w:r>
+                            <w:r>
+                              <w:rPr>
+                                <w:sz w:val="16"/>
+                                <w:szCs w:val="16"/>
+                              </w:rPr>
+                            </w:r>
                           </w:p>
                           <w:p>
                             <w:pPr>
@@ -1775,6 +1630,12 @@
                                 <w:szCs w:val="16"/>
                               </w:rPr>
                               <w:t xml:space="preserve">sleeping in the heart, a faint shadow</w:t>
+                            </w:r>
+                            <w:r>
+                              <w:rPr>
+                                <w:sz w:val="16"/>
+                                <w:szCs w:val="16"/>
+                              </w:rPr>
                             </w:r>
                             <w:r>
                               <w:rPr>
@@ -1808,7 +1669,7 @@
                             </w:r>
                             <w:r>
                               <w:rPr>
-                                <w:rFonts w:ascii="Open Sans" w:hAnsi="Open Sans" w:eastAsia="Open Sans" w:cs="Open Sans"/>
+                                <w:rFonts w:ascii="Open Sans" w:hAnsi="Open Sans" w:cs="Open Sans"/>
                                 <w:b w:val="0"/>
                                 <w:bCs w:val="0"/>
                                 <w:sz w:val="16"/>
@@ -1865,6 +1726,12 @@
                           <w:szCs w:val="16"/>
                         </w:rPr>
                       </w:r>
+                      <w:r>
+                        <w:rPr>
+                          <w:sz w:val="16"/>
+                          <w:szCs w:val="16"/>
+                        </w:rPr>
+                      </w:r>
                     </w:p>
                     <w:p>
                       <w:pPr>
@@ -1885,6 +1752,12 @@
                           <w:szCs w:val="16"/>
                         </w:rPr>
                         <w:t xml:space="preserve">sleeping in the heart, a faint shadow</w:t>
+                      </w:r>
+                      <w:r>
+                        <w:rPr>
+                          <w:sz w:val="16"/>
+                          <w:szCs w:val="16"/>
+                        </w:rPr>
                       </w:r>
                       <w:r>
                         <w:rPr>
@@ -1918,7 +1791,7 @@
                       </w:r>
                       <w:r>
                         <w:rPr>
-                          <w:rFonts w:ascii="Open Sans" w:hAnsi="Open Sans" w:eastAsia="Open Sans" w:cs="Open Sans"/>
+                          <w:rFonts w:ascii="Open Sans" w:hAnsi="Open Sans" w:cs="Open Sans"/>
                           <w:b w:val="0"/>
                           <w:bCs w:val="0"/>
                           <w:sz w:val="16"/>
@@ -1942,9 +1815,6 @@
           </mc:Fallback>
         </mc:AlternateContent>
       </w:r>
-      <w:r/>
-      <w:r/>
-      <w:r/>
       <w:r>
         <mc:AlternateContent>
           <mc:Choice Requires="wpg">
@@ -2043,10 +1913,9 @@
                               </w:rPr>
                               <w:t xml:space="preserve">the flower, or her?</w:t>
                             </w:r>
-                            <w:r/>
                             <w:r>
                               <w:rPr>
-                                <w:rFonts w:ascii="Open Sans" w:hAnsi="Open Sans" w:eastAsia="Open Sans" w:cs="Open Sans"/>
+                                <w:rFonts w:ascii="Open Sans" w:hAnsi="Open Sans" w:cs="Open Sans"/>
                                 <w:b w:val="0"/>
                                 <w:bCs w:val="0"/>
                                 <w:sz w:val="16"/>
@@ -2138,10 +2007,9 @@
                         </w:rPr>
                         <w:t xml:space="preserve">the flower, or her?</w:t>
                       </w:r>
-                      <w:r/>
                       <w:r>
                         <w:rPr>
-                          <w:rFonts w:ascii="Open Sans" w:hAnsi="Open Sans" w:eastAsia="Open Sans" w:cs="Open Sans"/>
+                          <w:rFonts w:ascii="Open Sans" w:hAnsi="Open Sans" w:cs="Open Sans"/>
                           <w:b w:val="0"/>
                           <w:bCs w:val="0"/>
                           <w:sz w:val="16"/>
@@ -2260,12 +2128,8 @@
                               </w:rPr>
                               <w:t xml:space="preserve">the stem rising straight, her back curved</w:t>
                             </w:r>
-                            <w:r/>
                             <w:r>
                               <w:rPr>
-                                <w:rFonts w:ascii="Open Sans" w:hAnsi="Open Sans" w:eastAsia="Open Sans" w:cs="Open Sans"/>
-                                <w:b w:val="0"/>
-                                <w:bCs w:val="0"/>
                                 <w:sz w:val="16"/>
                                 <w:szCs w:val="16"/>
                               </w:rPr>
@@ -2349,12 +2213,8 @@
                         </w:rPr>
                         <w:t xml:space="preserve">the stem rising straight, her back curved</w:t>
                       </w:r>
-                      <w:r/>
                       <w:r>
                         <w:rPr>
-                          <w:rFonts w:ascii="Open Sans" w:hAnsi="Open Sans" w:eastAsia="Open Sans" w:cs="Open Sans"/>
-                          <w:b w:val="0"/>
-                          <w:bCs w:val="0"/>
                           <w:sz w:val="16"/>
                           <w:szCs w:val="16"/>
                         </w:rPr>
@@ -2445,6 +2305,12 @@
                                 <w:szCs w:val="16"/>
                               </w:rPr>
                             </w:r>
+                            <w:r>
+                              <w:rPr>
+                                <w:sz w:val="16"/>
+                                <w:szCs w:val="16"/>
+                              </w:rPr>
+                            </w:r>
                           </w:p>
                           <w:p>
                             <w:pPr>
@@ -2465,6 +2331,12 @@
                                 <w:szCs w:val="16"/>
                               </w:rPr>
                               <w:t xml:space="preserve">like a quiet memory</w:t>
+                            </w:r>
+                            <w:r>
+                              <w:rPr>
+                                <w:sz w:val="16"/>
+                                <w:szCs w:val="16"/>
+                              </w:rPr>
                             </w:r>
                             <w:r>
                               <w:rPr>
@@ -2504,6 +2376,9 @@
                             </w:r>
                             <w:r>
                               <w:rPr>
+                                <w:rFonts w:ascii="Open Sans" w:hAnsi="Open Sans" w:eastAsia="Open Sans" w:cs="Open Sans"/>
+                                <w:b w:val="0"/>
+                                <w:bCs w:val="0"/>
                                 <w:sz w:val="16"/>
                                 <w:szCs w:val="16"/>
                               </w:rPr>
@@ -2558,6 +2433,12 @@
                           <w:szCs w:val="16"/>
                         </w:rPr>
                       </w:r>
+                      <w:r>
+                        <w:rPr>
+                          <w:sz w:val="16"/>
+                          <w:szCs w:val="16"/>
+                        </w:rPr>
+                      </w:r>
                     </w:p>
                     <w:p>
                       <w:pPr>
@@ -2578,6 +2459,12 @@
                           <w:szCs w:val="16"/>
                         </w:rPr>
                         <w:t xml:space="preserve">like a quiet memory</w:t>
+                      </w:r>
+                      <w:r>
+                        <w:rPr>
+                          <w:sz w:val="16"/>
+                          <w:szCs w:val="16"/>
+                        </w:rPr>
                       </w:r>
                       <w:r>
                         <w:rPr>
@@ -2617,6 +2504,9 @@
                       </w:r>
                       <w:r>
                         <w:rPr>
+                          <w:rFonts w:ascii="Open Sans" w:hAnsi="Open Sans" w:eastAsia="Open Sans" w:cs="Open Sans"/>
+                          <w:b w:val="0"/>
+                          <w:bCs w:val="0"/>
                           <w:sz w:val="16"/>
                           <w:szCs w:val="16"/>
                         </w:rPr>
@@ -2692,6 +2582,12 @@
                                 <w:szCs w:val="16"/>
                               </w:rPr>
                             </w:r>
+                            <w:r>
+                              <w:rPr>
+                                <w:sz w:val="16"/>
+                                <w:szCs w:val="16"/>
+                              </w:rPr>
+                            </w:r>
                           </w:p>
                           <w:p>
                             <w:pPr>
@@ -2712,6 +2608,12 @@
                                 <w:szCs w:val="16"/>
                               </w:rPr>
                               <w:t xml:space="preserve">between sky and hand —</w:t>
+                            </w:r>
+                            <w:r>
+                              <w:rPr>
+                                <w:sz w:val="16"/>
+                                <w:szCs w:val="16"/>
+                              </w:rPr>
                             </w:r>
                             <w:r>
                               <w:rPr>
@@ -2742,9 +2644,6 @@
                             </w:r>
                             <w:r>
                               <w:rPr>
-                                <w:rFonts w:ascii="Open Sans" w:hAnsi="Open Sans" w:eastAsia="Open Sans" w:cs="Open Sans"/>
-                                <w:b w:val="0"/>
-                                <w:bCs w:val="0"/>
                                 <w:sz w:val="16"/>
                                 <w:szCs w:val="16"/>
                               </w:rPr>
@@ -2838,6 +2737,12 @@
                           <w:szCs w:val="16"/>
                         </w:rPr>
                       </w:r>
+                      <w:r>
+                        <w:rPr>
+                          <w:sz w:val="16"/>
+                          <w:szCs w:val="16"/>
+                        </w:rPr>
+                      </w:r>
                     </w:p>
                     <w:p>
                       <w:pPr>
@@ -2858,6 +2763,12 @@
                           <w:szCs w:val="16"/>
                         </w:rPr>
                         <w:t xml:space="preserve">between sky and hand —</w:t>
+                      </w:r>
+                      <w:r>
+                        <w:rPr>
+                          <w:sz w:val="16"/>
+                          <w:szCs w:val="16"/>
+                        </w:rPr>
                       </w:r>
                       <w:r>
                         <w:rPr>
@@ -2888,9 +2799,6 @@
                       </w:r>
                       <w:r>
                         <w:rPr>
-                          <w:rFonts w:ascii="Open Sans" w:hAnsi="Open Sans" w:eastAsia="Open Sans" w:cs="Open Sans"/>
-                          <w:b w:val="0"/>
-                          <w:bCs w:val="0"/>
                           <w:sz w:val="16"/>
                           <w:szCs w:val="16"/>
                         </w:rPr>
@@ -2981,7 +2889,7 @@
                         <pic:nvPr/>
                       </pic:nvPicPr>
                       <pic:blipFill rotWithShape="1">
-                        <a:blip r:embed="rId10"/>
+                        <a:blip r:embed="rId11"/>
                         <a:stretch/>
                       </pic:blipFill>
                       <pic:spPr bwMode="auto">
@@ -3021,18 +2929,13 @@
                 <o:lock v:ext="edit" aspectratio="t"/>
               </v:shapetype>
               <v:shape id="_x0000_i14" o:spid="_x0000_s14" type="#_x0000_t75" style="position:absolute;z-index:-65536;o:allowoverlap:true;o:allowincell:true;mso-position-horizontal-relative:text;margin-left:-43.56pt;mso-position-horizontal:absolute;mso-position-vertical-relative:text;margin-top:165.75pt;mso-position-vertical:absolute;width:558.35pt;height:271.54pt;mso-wrap-distance-left:9.07pt;mso-wrap-distance-top:0.00pt;mso-wrap-distance-right:9.07pt;mso-wrap-distance-bottom:0.00pt;z-index:1;" stroked="false">
-                <v:imagedata r:id="rId10" o:title=""/>
+                <v:imagedata r:id="rId11" o:title=""/>
                 <o:lock v:ext="edit" rotation="t"/>
               </v:shape>
             </w:pict>
           </mc:Fallback>
         </mc:AlternateContent>
       </w:r>
-      <w:r/>
-      <w:r/>
-      <w:r/>
-      <w:r/>
-      <w:r/>
       <w:r/>
     </w:p>
     <w:sectPr>

</xml_diff>